<commit_message>
安全收尾 + Windows CI 用真实 Edge 跑 CDP 集成（SEC-003/004）
安全（SEC-003 / SEC-004，规范 v1.2 增补）：
- WebSocket 令牌改由 Sec-WebSocket-Protocol 子协议携带（base64url），不再进入
  URL、访问日志、浏览器历史或 Referer；服务端只回选非机密 epc.v1 应答子协议，
  不回显令牌。HTTP API 仍用 Bearer；?token= 仅作兼容回退。
- /health 收敛为 ok/service/version/uptimeSeconds，运行拓扑（PID、连接数、
  Edge 进程与重启、重连计时）移到令牌保护的 /api/status。
- 自动生成令牌支持一键在线轮换（WS rotateToken）；固定令牌明确拒绝轮换。
- 新增 test/ws-auth.test.js 覆盖以上；browser-ui 在真实 Chromium 中端到端
  验证子协议握手。

真机化验证（本次最有价值的改进）：
- Windows CI 作业改用真实 Microsoft Edge（Edge 即 Chromium 内核）跑真实 CDP
  集成测试，把大量“需 Windows Edge 验证”欠账变成每次提交的自动回归。

产品打磨：
- 全屏悬浮工具新增“剪贴板”按钮；剪贴板过大/超时给出友好中文提示。

CI 卫生：
- actions/checkout 与 setup-node 升级到 v5，清除 Node 20 弃用告警。

文档：规范 v1.2 增 SEC-003/004（含 .docx 重生成）、YAML 基线、v6.8.0 对照表、
更新说明与发布验证报告同步。

验证：check / npm test（16 套件）/ test:real / test:browser 在本容器全部通过；
发布 ZIP 内部清单 88 文件校验 0 不匹配、无敏感文件泄露。

Co-Authored-By: Claude Fable 5 <noreply@anthropic.com>
Claude-Session: https://claude.ai/code/session_01JD2iT3jivYapmjmrhWRCj9
</commit_message>
<xml_diff>
--- a/02-AI交接/Edge手机远程浏览器控制器-需求与风险平衡规范-v1.2.docx
+++ b/02-AI交接/Edge手机远程浏览器控制器-需求与风险平衡规范-v1.2.docx
@@ -89,6 +89,14 @@
       </w:pPr>
       <w:r>
         <w:t>**REL-004 CI 交付**：ZIP、内部 SHA-256 清单和外部 ZIP SHA-256 由 CI 在打 tag 时自动生成；交接材料从单一 `02-AI交接/` 源复制进 ZIP。</w:t>
+      </w:r>
+    </w:p>
+    <w:p>
+      <w:pPr>
+        <w:pStyle w:val="ListBullet"/>
+      </w:pPr>
+      <w:r>
+        <w:t>**SEC-003 / SEC-004 安全收尾**：手机 WebSocket 令牌改由 Sec-WebSocket-Protocol 子协议携带，不再进入 URL/日志；`/health` 收敛为存活性最小字段；自动生成的令牌支持一键在线轮换。CI 的 Windows 作业用真实 Microsoft Edge（Edge 即 Chromium）跑真实 CDP 集成，把大量“需 Windows Edge 验证”欠账变成每次提交的回归测试。</w:t>
       </w:r>
     </w:p>
     <w:p>
@@ -2488,6 +2496,90 @@
           </w:tcPr>
           <w:p>
             <w:r>
+              <w:t>SEC-003</w:t>
+            </w:r>
+          </w:p>
+        </w:tc>
+        <w:tc>
+          <w:tcPr>
+            <w:tcW w:type="dxa" w:w="2160"/>
+          </w:tcPr>
+          <w:p>
+            <w:r>
+              <w:t>MUST</w:t>
+            </w:r>
+          </w:p>
+        </w:tc>
+        <w:tc>
+          <w:tcPr>
+            <w:tcW w:type="dxa" w:w="2160"/>
+          </w:tcPr>
+          <w:p>
+            <w:r>
+              <w:t>令牌不入 URL</w:t>
+            </w:r>
+          </w:p>
+        </w:tc>
+        <w:tc>
+          <w:tcPr>
+            <w:tcW w:type="dxa" w:w="2160"/>
+          </w:tcPr>
+          <w:p>
+            <w:r>
+              <w:t>手机 WebSocket 认证通过 Sec-WebSocket-Protocol 子协议携带令牌（base64url），令牌不得出现在 WebSocket URL 中，从而不进入访问日志、浏览器历史或 Referer；服务端只回选非机密应答子协议，不回显令牌。HTTP API 用 Authorization: Bearer。?token= 仅作兼容回退。/health 无令牌可访问，只返回存活性最小字段，不泄露 PID、连接数或 Edge 进程拓扑。</w:t>
+            </w:r>
+          </w:p>
+        </w:tc>
+      </w:tr>
+      <w:tr>
+        <w:tc>
+          <w:tcPr>
+            <w:tcW w:type="dxa" w:w="2160"/>
+          </w:tcPr>
+          <w:p>
+            <w:r>
+              <w:t>SEC-004</w:t>
+            </w:r>
+          </w:p>
+        </w:tc>
+        <w:tc>
+          <w:tcPr>
+            <w:tcW w:type="dxa" w:w="2160"/>
+          </w:tcPr>
+          <w:p>
+            <w:r>
+              <w:t>MUST</w:t>
+            </w:r>
+          </w:p>
+        </w:tc>
+        <w:tc>
+          <w:tcPr>
+            <w:tcW w:type="dxa" w:w="2160"/>
+          </w:tcPr>
+          <w:p>
+            <w:r>
+              <w:t>令牌可轮换</w:t>
+            </w:r>
+          </w:p>
+        </w:tc>
+        <w:tc>
+          <w:tcPr>
+            <w:tcW w:type="dxa" w:w="2160"/>
+          </w:tcPr>
+          <w:p>
+            <w:r>
+              <w:t>自动生成并存于 data/access-token.txt 的令牌必须支持由已认证控制端一键在线轮换（旧令牌立即失效、发起方用新令牌重连）；由环境变量或配置固定的令牌不可在线轮换，必须明确拒绝。</w:t>
+            </w:r>
+          </w:p>
+        </w:tc>
+      </w:tr>
+      <w:tr>
+        <w:tc>
+          <w:tcPr>
+            <w:tcW w:type="dxa" w:w="2160"/>
+          </w:tcPr>
+          <w:p>
+            <w:r>
               <w:t>PRIV-001</w:t>
             </w:r>
           </w:p>

</xml_diff>